<commit_message>
fix: denser Word layout and bordered data tables
From the review notes in template.docx: headings sit on a single line
height with space above and a little below by level, body paragraphs get
6 pt after and nothing before, the line height is Word's 1.15 instead of
the brand's screen value of 1.5, and the margins are 20 mm. Data tables
get all borders in ink and a tinted bold first row through a new
OwdTable style that docx-tables.lua assigns to Table elements; Quarto's
caption and figure wrappers and callouts stay on the border free Table
style. The generator now also sets the page margins in document.xml.

Co-Authored-By: Claude Fable 5.1 <noreply@anthropic.com>
Claude-Session: https://claude.ai/code/session_01YZGMkJRUtmXRukGv5PLhEx
</commit_message>
<xml_diff>
--- a/_extensions/owd/reference.docx
+++ b/_extensions/owd/reference.docx
@@ -318,7 +318,7 @@
         <w:numRestart w:val="eachSect"/>
       </w:footnotePr>
       <w:pgSz w:w="11906" w:h="16838"/>
-      <w:pgMar w:top="1417" w:right="1417" w:bottom="1417" w:left="1417" w:header="709" w:footer="709" w:gutter="0"/>
+      <w:pgMar w:top="1134" w:right="1134" w:bottom="1134" w:left="1134" w:header="709" w:footer="709" w:gutter="0"/>
     </w:sectPr>
   </w:body>
 </w:document>
@@ -505,7 +505,7 @@
     <w:name w:val="Normal"/>
     <w:qFormat/>
     <w:pPr>
-      <w:spacing w:line="360" w:lineRule="auto"/>
+      <w:spacing w:line="276" w:lineRule="auto"/>
     </w:pPr>
   </w:style>
   <w:style w:type="paragraph" w:styleId="BodyText">
@@ -514,7 +514,7 @@
     <w:link w:val="BodyTextChar"/>
     <w:qFormat/>
     <w:pPr>
-      <w:spacing w:before="180" w:after="180"/>
+      <w:spacing w:before="0" w:after="120"/>
     </w:pPr>
   </w:style>
   <w:style w:type="paragraph" w:customStyle="1" w:styleId="FirstParagraph">
@@ -639,7 +639,7 @@
     <w:pPr>
       <w:keepNext/>
       <w:keepLines/>
-      <w:spacing w:before="300" w:after="0"/>
+      <w:spacing w:before="200" w:after="0"/>
       <w:jc w:val="center"/>
     </w:pPr>
     <w:rPr>
@@ -656,7 +656,7 @@
     <w:pPr>
       <w:keepNext/>
       <w:keepLines/>
-      <w:spacing w:before="100" w:after="300"/>
+      <w:spacing w:before="100" w:after="200"/>
     </w:pPr>
     <w:rPr>
       <w:sz w:val="20"/>
@@ -682,7 +682,7 @@
     <w:pPr>
       <w:keepNext/>
       <w:keepLines/>
-      <w:spacing w:before="360" w:after="80"/>
+      <w:spacing w:before="360" w:after="120" w:line="240" w:lineRule="auto"/>
       <w:outlineLvl w:val="0"/>
     </w:pPr>
     <w:rPr>
@@ -707,7 +707,7 @@
     <w:pPr>
       <w:keepNext/>
       <w:keepLines/>
-      <w:spacing w:before="160" w:after="80"/>
+      <w:spacing w:before="240" w:after="80" w:line="240" w:lineRule="auto"/>
       <w:outlineLvl w:val="1"/>
     </w:pPr>
     <w:rPr>
@@ -732,7 +732,7 @@
     <w:pPr>
       <w:keepNext/>
       <w:keepLines/>
-      <w:spacing w:before="160" w:after="80"/>
+      <w:spacing w:before="200" w:after="60" w:line="240" w:lineRule="auto"/>
       <w:outlineLvl w:val="2"/>
     </w:pPr>
     <w:rPr>
@@ -757,7 +757,7 @@
     <w:pPr>
       <w:keepNext/>
       <w:keepLines/>
-      <w:spacing w:before="80" w:after="40"/>
+      <w:spacing w:before="160" w:after="40" w:line="240" w:lineRule="auto"/>
       <w:outlineLvl w:val="3"/>
     </w:pPr>
     <w:rPr>
@@ -782,7 +782,7 @@
     <w:pPr>
       <w:keepNext/>
       <w:keepLines/>
-      <w:spacing w:before="80" w:after="40"/>
+      <w:spacing w:before="160" w:after="40" w:line="240" w:lineRule="auto"/>
       <w:outlineLvl w:val="4"/>
     </w:pPr>
     <w:rPr>
@@ -805,7 +805,7 @@
     <w:pPr>
       <w:keepNext/>
       <w:keepLines/>
-      <w:spacing w:before="40" w:after="0"/>
+      <w:spacing w:before="160" w:after="40" w:line="240" w:lineRule="auto"/>
       <w:outlineLvl w:val="5"/>
     </w:pPr>
     <w:rPr>
@@ -830,7 +830,7 @@
     <w:pPr>
       <w:keepNext/>
       <w:keepLines/>
-      <w:spacing w:before="40" w:after="0"/>
+      <w:spacing w:before="160" w:after="40" w:line="240" w:lineRule="auto"/>
       <w:outlineLvl w:val="6"/>
     </w:pPr>
     <w:rPr>
@@ -853,7 +853,7 @@
     <w:pPr>
       <w:keepNext/>
       <w:keepLines/>
-      <w:spacing w:after="0"/>
+      <w:spacing w:after="40" w:before="160" w:line="240" w:lineRule="auto"/>
       <w:outlineLvl w:val="7"/>
     </w:pPr>
     <w:rPr>
@@ -878,7 +878,7 @@
     <w:pPr>
       <w:keepNext/>
       <w:keepLines/>
-      <w:spacing w:after="0"/>
+      <w:spacing w:after="40" w:before="160" w:line="240" w:lineRule="auto"/>
       <w:outlineLvl w:val="8"/>
     </w:pPr>
     <w:rPr>
@@ -1077,7 +1077,155 @@
         <w:right w:w="108" w:type="dxa"/>
       </w:tblCellMar>
     </w:tblPr>
-    <w:tblStylePr xmlns:w="http://schemas.openxmlformats.org/wordprocessingml/2006/main" w:type="firstRow">
+  </w:style>
+  <w:style w:type="paragraph" w:customStyle="1" w:styleId="DefinitionTerm">
+    <w:name w:val="Definition Term"/>
+    <w:basedOn w:val="Normal"/>
+    <w:next w:val="Definition"/>
+    <w:pPr>
+      <w:keepNext/>
+      <w:keepLines/>
+      <w:spacing w:after="0"/>
+    </w:pPr>
+    <w:rPr>
+      <w:b/>
+    </w:rPr>
+  </w:style>
+  <w:style w:type="paragraph" w:customStyle="1" w:styleId="Definition">
+    <w:name w:val="Definition"/>
+    <w:basedOn w:val="Normal"/>
+  </w:style>
+  <w:style w:type="paragraph" w:styleId="Caption">
+    <w:name w:val="Caption"/>
+    <w:basedOn w:val="Normal"/>
+    <w:link w:val="BodyTextChar"/>
+    <w:pPr>
+      <w:spacing w:before="0" w:after="120"/>
+    </w:pPr>
+    <w:rPr>
+      <w:i/>
+      <w:iCs/>
+      <w:sz w:val="20"/>
+      <w:szCs w:val="20"/>
+    </w:rPr>
+  </w:style>
+  <w:style w:type="paragraph" w:customStyle="1" w:styleId="TableCaption">
+    <w:name w:val="Table Caption"/>
+    <w:basedOn w:val="Caption"/>
+    <w:pPr>
+      <w:keepNext/>
+    </w:pPr>
+    <w:rPr>
+      <w:i/>
+      <w:iCs/>
+      <w:sz w:val="20"/>
+      <w:szCs w:val="20"/>
+    </w:rPr>
+  </w:style>
+  <w:style w:type="paragraph" w:customStyle="1" w:styleId="ImageCaption">
+    <w:name w:val="Image Caption"/>
+    <w:basedOn w:val="Caption"/>
+    <w:rPr>
+      <w:i/>
+      <w:iCs/>
+      <w:sz w:val="20"/>
+      <w:szCs w:val="20"/>
+    </w:rPr>
+  </w:style>
+  <w:style w:type="paragraph" w:customStyle="1" w:styleId="Figure">
+    <w:name w:val="Figure"/>
+    <w:basedOn w:val="Normal"/>
+  </w:style>
+  <w:style w:type="paragraph" w:customStyle="1" w:styleId="CaptionedFigure">
+    <w:name w:val="Captioned Figure"/>
+    <w:basedOn w:val="Figure"/>
+    <w:pPr>
+      <w:keepNext/>
+    </w:pPr>
+  </w:style>
+  <w:style w:type="character" w:customStyle="1" w:styleId="BodyTextChar">
+    <w:name w:val="Body Text Char"/>
+    <w:basedOn w:val="DefaultParagraphFont"/>
+    <w:link w:val="BodyText"/>
+  </w:style>
+  <w:style w:type="character" w:customStyle="1" w:styleId="VerbatimChar">
+    <w:name w:val="Verbatim Char"/>
+    <w:basedOn w:val="BodyTextChar"/>
+    <w:rPr>
+      <w:rFonts w:ascii="Source Code Pro" w:hAnsi="Source Code Pro" w:cs="Source Code Pro"/>
+      <w:sz w:val="22"/>
+    </w:rPr>
+  </w:style>
+  <w:style w:type="character" w:customStyle="1" w:styleId="SectionNumber">
+    <w:name w:val="Section Number"/>
+    <w:basedOn w:val="BodyTextChar"/>
+  </w:style>
+  <w:style w:type="character" w:styleId="FootnoteReference">
+    <w:name w:val="Footnote Reference"/>
+    <w:basedOn w:val="BodyTextChar"/>
+    <w:rPr>
+      <w:vertAlign w:val="superscript"/>
+    </w:rPr>
+  </w:style>
+  <w:style w:type="character" w:styleId="Hyperlink">
+    <w:name w:val="Hyperlink"/>
+    <w:basedOn w:val="BodyTextChar"/>
+    <w:rPr>
+      <w:color w:val="272BD1"/>
+    </w:rPr>
+  </w:style>
+  <w:style w:type="paragraph" w:styleId="TOCHeading">
+    <w:name w:val="TOC Heading"/>
+    <w:basedOn w:val="Heading1"/>
+    <w:next w:val="BodyText"/>
+    <w:uiPriority w:val="39"/>
+    <w:unhideWhenUsed/>
+    <w:qFormat/>
+    <w:pPr>
+      <w:spacing w:before="240" w:line="259" w:lineRule="auto"/>
+      <w:outlineLvl w:val="9"/>
+    </w:pPr>
+    <w:rPr>
+      <w:rFonts w:ascii="Atkinson Hyperlegible" w:hAnsi="Atkinson Hyperlegible" w:cs="Atkinson Hyperlegible"/>
+      <w:b w:val="0"/>
+      <w:bCs w:val="0"/>
+      <w:color w:val="5B195B"/>
+    </w:rPr>
+  </w:style>
+  <w:style xmlns:w="http://schemas.openxmlformats.org/wordprocessingml/2006/main" w:type="paragraph" w:customStyle="1" w:styleId="SourceCode">
+    <w:name w:val="Source Code"/>
+    <w:basedOn w:val="Normal"/>
+    <w:pPr>
+      <w:shd w:val="clear" w:color="auto" w:fill="F2F2F2"/>
+      <w:wordWrap w:val="0"/>
+      <w:spacing w:before="120" w:after="120" w:line="240" w:lineRule="auto"/>
+    </w:pPr>
+    <w:rPr>
+      <w:rFonts w:ascii="Source Code Pro" w:hAnsi="Source Code Pro" w:cs="Source Code Pro"/>
+      <w:sz w:val="20"/>
+      <w:szCs w:val="20"/>
+    </w:rPr>
+  </w:style>
+  <w:style xmlns:w="http://schemas.openxmlformats.org/wordprocessingml/2006/main" w:type="table" w:customStyle="1" w:styleId="OwdTable">
+    <w:name w:val="OwdTable"/>
+    <w:basedOn w:val="Table"/>
+    <w:tblPr>
+      <w:tblBorders>
+        <w:top w:val="single" w:sz="4" w:space="0" w:color="1E1E1E"/>
+        <w:left w:val="single" w:sz="4" w:space="0" w:color="1E1E1E"/>
+        <w:bottom w:val="single" w:sz="4" w:space="0" w:color="1E1E1E"/>
+        <w:right w:val="single" w:sz="4" w:space="0" w:color="1E1E1E"/>
+        <w:insideH w:val="single" w:sz="4" w:space="0" w:color="1E1E1E"/>
+        <w:insideV w:val="single" w:sz="4" w:space="0" w:color="1E1E1E"/>
+      </w:tblBorders>
+      <w:tblCellMar>
+        <w:top w:w="40" w:type="dxa"/>
+        <w:left w:w="108" w:type="dxa"/>
+        <w:bottom w:w="40" w:type="dxa"/>
+        <w:right w:w="108" w:type="dxa"/>
+      </w:tblCellMar>
+    </w:tblPr>
+    <w:tblStylePr w:type="firstRow">
       <w:rPr>
         <w:b/>
         <w:bCs/>
@@ -1086,134 +1234,6 @@
         <w:shd w:val="clear" w:color="auto" w:fill="E6DCE6"/>
       </w:tcPr>
     </w:tblStylePr>
-  </w:style>
-  <w:style w:type="paragraph" w:customStyle="1" w:styleId="DefinitionTerm">
-    <w:name w:val="Definition Term"/>
-    <w:basedOn w:val="Normal"/>
-    <w:next w:val="Definition"/>
-    <w:pPr>
-      <w:keepNext/>
-      <w:keepLines/>
-      <w:spacing w:after="0"/>
-    </w:pPr>
-    <w:rPr>
-      <w:b/>
-    </w:rPr>
-  </w:style>
-  <w:style w:type="paragraph" w:customStyle="1" w:styleId="Definition">
-    <w:name w:val="Definition"/>
-    <w:basedOn w:val="Normal"/>
-  </w:style>
-  <w:style w:type="paragraph" w:styleId="Caption">
-    <w:name w:val="Caption"/>
-    <w:basedOn w:val="Normal"/>
-    <w:link w:val="BodyTextChar"/>
-    <w:pPr>
-      <w:spacing w:before="0" w:after="120"/>
-    </w:pPr>
-    <w:rPr>
-      <w:i/>
-      <w:iCs/>
-      <w:sz w:val="20"/>
-      <w:szCs w:val="20"/>
-    </w:rPr>
-  </w:style>
-  <w:style w:type="paragraph" w:customStyle="1" w:styleId="TableCaption">
-    <w:name w:val="Table Caption"/>
-    <w:basedOn w:val="Caption"/>
-    <w:pPr>
-      <w:keepNext/>
-    </w:pPr>
-    <w:rPr>
-      <w:i/>
-      <w:iCs/>
-      <w:sz w:val="20"/>
-      <w:szCs w:val="20"/>
-    </w:rPr>
-  </w:style>
-  <w:style w:type="paragraph" w:customStyle="1" w:styleId="ImageCaption">
-    <w:name w:val="Image Caption"/>
-    <w:basedOn w:val="Caption"/>
-    <w:rPr>
-      <w:i/>
-      <w:iCs/>
-      <w:sz w:val="20"/>
-      <w:szCs w:val="20"/>
-    </w:rPr>
-  </w:style>
-  <w:style w:type="paragraph" w:customStyle="1" w:styleId="Figure">
-    <w:name w:val="Figure"/>
-    <w:basedOn w:val="Normal"/>
-  </w:style>
-  <w:style w:type="paragraph" w:customStyle="1" w:styleId="CaptionedFigure">
-    <w:name w:val="Captioned Figure"/>
-    <w:basedOn w:val="Figure"/>
-    <w:pPr>
-      <w:keepNext/>
-    </w:pPr>
-  </w:style>
-  <w:style w:type="character" w:customStyle="1" w:styleId="BodyTextChar">
-    <w:name w:val="Body Text Char"/>
-    <w:basedOn w:val="DefaultParagraphFont"/>
-    <w:link w:val="BodyText"/>
-  </w:style>
-  <w:style w:type="character" w:customStyle="1" w:styleId="VerbatimChar">
-    <w:name w:val="Verbatim Char"/>
-    <w:basedOn w:val="BodyTextChar"/>
-    <w:rPr>
-      <w:rFonts w:ascii="Source Code Pro" w:hAnsi="Source Code Pro" w:cs="Source Code Pro"/>
-      <w:sz w:val="22"/>
-    </w:rPr>
-  </w:style>
-  <w:style w:type="character" w:customStyle="1" w:styleId="SectionNumber">
-    <w:name w:val="Section Number"/>
-    <w:basedOn w:val="BodyTextChar"/>
-  </w:style>
-  <w:style w:type="character" w:styleId="FootnoteReference">
-    <w:name w:val="Footnote Reference"/>
-    <w:basedOn w:val="BodyTextChar"/>
-    <w:rPr>
-      <w:vertAlign w:val="superscript"/>
-    </w:rPr>
-  </w:style>
-  <w:style w:type="character" w:styleId="Hyperlink">
-    <w:name w:val="Hyperlink"/>
-    <w:basedOn w:val="BodyTextChar"/>
-    <w:rPr>
-      <w:color w:val="272BD1"/>
-    </w:rPr>
-  </w:style>
-  <w:style w:type="paragraph" w:styleId="TOCHeading">
-    <w:name w:val="TOC Heading"/>
-    <w:basedOn w:val="Heading1"/>
-    <w:next w:val="BodyText"/>
-    <w:uiPriority w:val="39"/>
-    <w:unhideWhenUsed/>
-    <w:qFormat/>
-    <w:pPr>
-      <w:spacing w:before="240" w:line="259" w:lineRule="auto"/>
-      <w:outlineLvl w:val="9"/>
-    </w:pPr>
-    <w:rPr>
-      <w:rFonts w:ascii="Atkinson Hyperlegible" w:hAnsi="Atkinson Hyperlegible" w:cs="Atkinson Hyperlegible"/>
-      <w:b w:val="0"/>
-      <w:bCs w:val="0"/>
-      <w:color w:val="5B195B"/>
-    </w:rPr>
-  </w:style>
-  <w:style xmlns:w="http://schemas.openxmlformats.org/wordprocessingml/2006/main" w:type="paragraph" w:customStyle="1" w:styleId="SourceCode">
-    <w:name w:val="Source Code"/>
-    <w:basedOn w:val="Normal"/>
-    <w:pPr>
-      <w:shd w:val="clear" w:color="auto" w:fill="F2F2F2"/>
-      <w:wordWrap w:val="0"/>
-      <w:spacing w:before="120" w:after="120" w:line="240" w:lineRule="auto"/>
-    </w:pPr>
-    <w:rPr>
-      <w:rFonts w:ascii="Source Code Pro" w:hAnsi="Source Code Pro" w:cs="Source Code Pro"/>
-      <w:sz w:val="20"/>
-      <w:szCs w:val="20"/>
-    </w:rPr>
   </w:style>
 </w:styles>
 </file>

</xml_diff>

<commit_message>
feat: follow openwashdata/brand 1.0.0
Brand mirror refreshed (Atkinson Hyperlegible Next, darkened orange, new
accents and roles, white logo variants with alt text). The Typst
template no longer sets a code block fill; Quarto applies the brand's
monospace-block background, and links come underlined from the brand.
The Word generator reads the code tint for blocks and inline code from
the brand (the R package spells the roles monospace_block and
background_color), knows the new font with Arial as substitute, and
removes font table entries the brand no longer uses. Version 0.4.0.

Assisted-by: Claude claude-fable-5-1
Claude-Session: https://claude.ai/code/session_01YZGMkJRUtmXRukGv5PLhEx
</commit_message>
<xml_diff>
--- a/_extensions/owd/reference.docx
+++ b/_extensions/owd/reference.docx
@@ -487,7 +487,7 @@
   <w:docDefaults>
     <w:rPrDefault>
       <w:rPr>
-        <w:rFonts w:ascii="Atkinson Hyperlegible" w:hAnsi="Atkinson Hyperlegible" w:cs="Atkinson Hyperlegible"/>
+        <w:rFonts w:ascii="Atkinson Hyperlegible Next" w:hAnsi="Atkinson Hyperlegible Next" w:cs="Atkinson Hyperlegible Next"/>
         <w:color w:val="1E1E1E"/>
         <w:sz w:val="24"/>
         <w:szCs w:val="24"/>
@@ -545,7 +545,7 @@
       <w:jc w:val="center"/>
     </w:pPr>
     <w:rPr>
-      <w:rFonts w:ascii="Atkinson Hyperlegible" w:hAnsi="Atkinson Hyperlegible" w:cs="Atkinson Hyperlegible"/>
+      <w:rFonts w:ascii="Atkinson Hyperlegible Next" w:hAnsi="Atkinson Hyperlegible Next" w:cs="Atkinson Hyperlegible Next"/>
       <w:b/>
       <w:bCs/>
       <w:color w:val="5B195B"/>
@@ -560,7 +560,7 @@
     <w:uiPriority w:val="10"/>
     <w:rsid w:val="00A10FD9"/>
     <w:rPr>
-      <w:rFonts w:ascii="Atkinson Hyperlegible" w:hAnsi="Atkinson Hyperlegible" w:cs="Atkinson Hyperlegible"/>
+      <w:rFonts w:ascii="Atkinson Hyperlegible Next" w:hAnsi="Atkinson Hyperlegible Next" w:cs="Atkinson Hyperlegible Next"/>
       <w:b/>
       <w:bCs/>
       <w:color w:val="5B195B"/>
@@ -582,7 +582,7 @@
       </w:numPr>
     </w:pPr>
     <w:rPr>
-      <w:rFonts w:ascii="Atkinson Hyperlegible" w:hAnsi="Atkinson Hyperlegible" w:cs="Atkinson Hyperlegible"/>
+      <w:rFonts w:ascii="Atkinson Hyperlegible Next" w:hAnsi="Atkinson Hyperlegible Next" w:cs="Atkinson Hyperlegible Next"/>
       <w:color w:val="1E1E1E"/>
       <w:spacing w:val="15"/>
       <w:sz w:val="28"/>
@@ -596,7 +596,7 @@
     <w:uiPriority w:val="11"/>
     <w:rsid w:val="00A10FD9"/>
     <w:rPr>
-      <w:rFonts w:ascii="Atkinson Hyperlegible" w:hAnsi="Atkinson Hyperlegible" w:cs="Atkinson Hyperlegible"/>
+      <w:rFonts w:ascii="Atkinson Hyperlegible Next" w:hAnsi="Atkinson Hyperlegible Next" w:cs="Atkinson Hyperlegible Next"/>
       <w:color w:val="1E1E1E"/>
       <w:spacing w:val="15"/>
       <w:sz w:val="28"/>
@@ -686,7 +686,7 @@
       <w:outlineLvl w:val="0"/>
     </w:pPr>
     <w:rPr>
-      <w:rFonts w:ascii="Atkinson Hyperlegible" w:hAnsi="Atkinson Hyperlegible" w:cs="Atkinson Hyperlegible"/>
+      <w:rFonts w:ascii="Atkinson Hyperlegible Next" w:hAnsi="Atkinson Hyperlegible Next" w:cs="Atkinson Hyperlegible Next"/>
       <w:b/>
       <w:bCs/>
       <w:color w:val="5B195B"/>
@@ -711,7 +711,7 @@
       <w:outlineLvl w:val="1"/>
     </w:pPr>
     <w:rPr>
-      <w:rFonts w:ascii="Atkinson Hyperlegible" w:hAnsi="Atkinson Hyperlegible" w:cs="Atkinson Hyperlegible"/>
+      <w:rFonts w:ascii="Atkinson Hyperlegible Next" w:hAnsi="Atkinson Hyperlegible Next" w:cs="Atkinson Hyperlegible Next"/>
       <w:b/>
       <w:bCs/>
       <w:color w:val="5B195B"/>
@@ -736,7 +736,7 @@
       <w:outlineLvl w:val="2"/>
     </w:pPr>
     <w:rPr>
-      <w:rFonts w:ascii="Atkinson Hyperlegible" w:hAnsi="Atkinson Hyperlegible" w:cs="Atkinson Hyperlegible"/>
+      <w:rFonts w:ascii="Atkinson Hyperlegible Next" w:hAnsi="Atkinson Hyperlegible Next" w:cs="Atkinson Hyperlegible Next"/>
       <w:b/>
       <w:bCs/>
       <w:color w:val="5B195B"/>
@@ -761,7 +761,7 @@
       <w:outlineLvl w:val="3"/>
     </w:pPr>
     <w:rPr>
-      <w:rFonts w:ascii="Atkinson Hyperlegible" w:hAnsi="Atkinson Hyperlegible" w:cs="Atkinson Hyperlegible"/>
+      <w:rFonts w:ascii="Atkinson Hyperlegible Next" w:hAnsi="Atkinson Hyperlegible Next" w:cs="Atkinson Hyperlegible Next"/>
       <w:b/>
       <w:bCs/>
       <w:i/>
@@ -786,7 +786,7 @@
       <w:outlineLvl w:val="4"/>
     </w:pPr>
     <w:rPr>
-      <w:rFonts w:ascii="Atkinson Hyperlegible" w:hAnsi="Atkinson Hyperlegible" w:cs="Atkinson Hyperlegible"/>
+      <w:rFonts w:ascii="Atkinson Hyperlegible Next" w:hAnsi="Atkinson Hyperlegible Next" w:cs="Atkinson Hyperlegible Next"/>
       <w:b/>
       <w:bCs/>
       <w:color w:val="5B195B"/>
@@ -809,7 +809,7 @@
       <w:outlineLvl w:val="5"/>
     </w:pPr>
     <w:rPr>
-      <w:rFonts w:ascii="Atkinson Hyperlegible" w:hAnsi="Atkinson Hyperlegible" w:cs="Atkinson Hyperlegible"/>
+      <w:rFonts w:ascii="Atkinson Hyperlegible Next" w:hAnsi="Atkinson Hyperlegible Next" w:cs="Atkinson Hyperlegible Next"/>
       <w:b/>
       <w:bCs/>
       <w:i/>
@@ -834,7 +834,7 @@
       <w:outlineLvl w:val="6"/>
     </w:pPr>
     <w:rPr>
-      <w:rFonts w:ascii="Atkinson Hyperlegible" w:hAnsi="Atkinson Hyperlegible" w:cs="Atkinson Hyperlegible"/>
+      <w:rFonts w:ascii="Atkinson Hyperlegible Next" w:hAnsi="Atkinson Hyperlegible Next" w:cs="Atkinson Hyperlegible Next"/>
       <w:b/>
       <w:bCs/>
       <w:color w:val="5B195B"/>
@@ -857,7 +857,7 @@
       <w:outlineLvl w:val="7"/>
     </w:pPr>
     <w:rPr>
-      <w:rFonts w:ascii="Atkinson Hyperlegible" w:hAnsi="Atkinson Hyperlegible" w:cs="Atkinson Hyperlegible"/>
+      <w:rFonts w:ascii="Atkinson Hyperlegible Next" w:hAnsi="Atkinson Hyperlegible Next" w:cs="Atkinson Hyperlegible Next"/>
       <w:b/>
       <w:bCs/>
       <w:i/>
@@ -882,7 +882,7 @@
       <w:outlineLvl w:val="8"/>
     </w:pPr>
     <w:rPr>
-      <w:rFonts w:ascii="Atkinson Hyperlegible" w:hAnsi="Atkinson Hyperlegible" w:cs="Atkinson Hyperlegible"/>
+      <w:rFonts w:ascii="Atkinson Hyperlegible Next" w:hAnsi="Atkinson Hyperlegible Next" w:cs="Atkinson Hyperlegible Next"/>
       <w:b/>
       <w:bCs/>
       <w:color w:val="5B195B"/>
@@ -895,7 +895,7 @@
     <w:uiPriority w:val="9"/>
     <w:rsid w:val="00A10FD9"/>
     <w:rPr>
-      <w:rFonts w:ascii="Atkinson Hyperlegible" w:hAnsi="Atkinson Hyperlegible" w:cs="Atkinson Hyperlegible"/>
+      <w:rFonts w:ascii="Atkinson Hyperlegible Next" w:hAnsi="Atkinson Hyperlegible Next" w:cs="Atkinson Hyperlegible Next"/>
       <w:b/>
       <w:bCs/>
       <w:color w:val="5B195B"/>
@@ -911,7 +911,7 @@
     <w:semiHidden/>
     <w:rsid w:val="00A10FD9"/>
     <w:rPr>
-      <w:rFonts w:ascii="Atkinson Hyperlegible" w:hAnsi="Atkinson Hyperlegible" w:cs="Atkinson Hyperlegible"/>
+      <w:rFonts w:ascii="Atkinson Hyperlegible Next" w:hAnsi="Atkinson Hyperlegible Next" w:cs="Atkinson Hyperlegible Next"/>
       <w:b/>
       <w:bCs/>
       <w:color w:val="5B195B"/>
@@ -927,7 +927,7 @@
     <w:semiHidden/>
     <w:rsid w:val="00A10FD9"/>
     <w:rPr>
-      <w:rFonts w:ascii="Atkinson Hyperlegible" w:hAnsi="Atkinson Hyperlegible" w:cs="Atkinson Hyperlegible"/>
+      <w:rFonts w:ascii="Atkinson Hyperlegible Next" w:hAnsi="Atkinson Hyperlegible Next" w:cs="Atkinson Hyperlegible Next"/>
       <w:b/>
       <w:bCs/>
       <w:color w:val="5B195B"/>
@@ -943,7 +943,7 @@
     <w:semiHidden/>
     <w:rsid w:val="00A10FD9"/>
     <w:rPr>
-      <w:rFonts w:ascii="Atkinson Hyperlegible" w:hAnsi="Atkinson Hyperlegible" w:cs="Atkinson Hyperlegible"/>
+      <w:rFonts w:ascii="Atkinson Hyperlegible Next" w:hAnsi="Atkinson Hyperlegible Next" w:cs="Atkinson Hyperlegible Next"/>
       <w:b/>
       <w:bCs/>
       <w:i/>
@@ -959,7 +959,7 @@
     <w:semiHidden/>
     <w:rsid w:val="00A10FD9"/>
     <w:rPr>
-      <w:rFonts w:ascii="Atkinson Hyperlegible" w:hAnsi="Atkinson Hyperlegible" w:cs="Atkinson Hyperlegible"/>
+      <w:rFonts w:ascii="Atkinson Hyperlegible Next" w:hAnsi="Atkinson Hyperlegible Next" w:cs="Atkinson Hyperlegible Next"/>
       <w:b/>
       <w:bCs/>
       <w:color w:val="5B195B"/>
@@ -973,7 +973,7 @@
     <w:semiHidden/>
     <w:rsid w:val="00A10FD9"/>
     <w:rPr>
-      <w:rFonts w:ascii="Atkinson Hyperlegible" w:hAnsi="Atkinson Hyperlegible" w:cs="Atkinson Hyperlegible"/>
+      <w:rFonts w:ascii="Atkinson Hyperlegible Next" w:hAnsi="Atkinson Hyperlegible Next" w:cs="Atkinson Hyperlegible Next"/>
       <w:b/>
       <w:bCs/>
       <w:i/>
@@ -989,7 +989,7 @@
     <w:semiHidden/>
     <w:rsid w:val="00A10FD9"/>
     <w:rPr>
-      <w:rFonts w:ascii="Atkinson Hyperlegible" w:hAnsi="Atkinson Hyperlegible" w:cs="Atkinson Hyperlegible"/>
+      <w:rFonts w:ascii="Atkinson Hyperlegible Next" w:hAnsi="Atkinson Hyperlegible Next" w:cs="Atkinson Hyperlegible Next"/>
       <w:b/>
       <w:bCs/>
       <w:color w:val="5B195B"/>
@@ -1003,7 +1003,7 @@
     <w:semiHidden/>
     <w:rsid w:val="00A10FD9"/>
     <w:rPr>
-      <w:rFonts w:ascii="Atkinson Hyperlegible" w:hAnsi="Atkinson Hyperlegible" w:cs="Atkinson Hyperlegible"/>
+      <w:rFonts w:ascii="Atkinson Hyperlegible Next" w:hAnsi="Atkinson Hyperlegible Next" w:cs="Atkinson Hyperlegible Next"/>
       <w:b/>
       <w:bCs/>
       <w:i/>
@@ -1019,7 +1019,7 @@
     <w:semiHidden/>
     <w:rsid w:val="00A10FD9"/>
     <w:rPr>
-      <w:rFonts w:ascii="Atkinson Hyperlegible" w:hAnsi="Atkinson Hyperlegible" w:cs="Atkinson Hyperlegible"/>
+      <w:rFonts w:ascii="Atkinson Hyperlegible Next" w:hAnsi="Atkinson Hyperlegible Next" w:cs="Atkinson Hyperlegible Next"/>
       <w:b/>
       <w:bCs/>
       <w:color w:val="5B195B"/>
@@ -1154,6 +1154,7 @@
     <w:rPr>
       <w:rFonts w:ascii="Source Code Pro" w:hAnsi="Source Code Pro" w:cs="Source Code Pro"/>
       <w:sz w:val="22"/>
+      <w:shd w:val="clear" w:color="auto" w:fill="F5EEF5"/>
     </w:rPr>
   </w:style>
   <w:style w:type="character" w:customStyle="1" w:styleId="SectionNumber">
@@ -1186,7 +1187,7 @@
       <w:outlineLvl w:val="9"/>
     </w:pPr>
     <w:rPr>
-      <w:rFonts w:ascii="Atkinson Hyperlegible" w:hAnsi="Atkinson Hyperlegible" w:cs="Atkinson Hyperlegible"/>
+      <w:rFonts w:ascii="Atkinson Hyperlegible Next" w:hAnsi="Atkinson Hyperlegible Next" w:cs="Atkinson Hyperlegible Next"/>
       <w:b w:val="0"/>
       <w:bCs w:val="0"/>
       <w:color w:val="5B195B"/>
@@ -1196,7 +1197,7 @@
     <w:name w:val="Source Code"/>
     <w:basedOn w:val="Normal"/>
     <w:pPr>
-      <w:shd w:val="clear" w:color="auto" w:fill="F2F2F2"/>
+      <w:shd w:val="clear" w:color="auto" w:fill="F5EEF5"/>
       <w:wordWrap w:val="0"/>
       <w:spacing w:before="120" w:after="120" w:line="240" w:lineRule="auto"/>
     </w:pPr>
@@ -1281,7 +1282,7 @@
     </a:clrScheme>
     <a:fontScheme name="Office">
       <a:majorFont>
-        <a:latin typeface="Atkinson Hyperlegible" panose="02110004020202020204"/>
+        <a:latin typeface="Atkinson Hyperlegible Next" panose="02110004020202020204"/>
         <a:ea typeface=""/>
         <a:cs typeface=""/>
         <a:font script="Jpan" typeface="游ゴシック Light"/>
@@ -1333,7 +1334,7 @@
         <a:font script="Tfng" typeface="Ebrima"/>
       </a:majorFont>
       <a:minorFont>
-        <a:latin typeface="Atkinson Hyperlegible" panose="02110004020202020204"/>
+        <a:latin typeface="Atkinson Hyperlegible Next" panose="02110004020202020204"/>
         <a:ea typeface=""/>
         <a:cs typeface=""/>
         <a:font script="Jpan" typeface="游明朝"/>

</xml_diff>